<commit_message>
feat(083): code-inject constant firm identity/boilerplate, visual fidelity, page-count check
- render_free_text() now takes client_name and code-injects title/date/
  identity header + confirmation/signature footer (never left to AI recall)
- adds bold/heading markup vocabulary (## headings, **bold** spans) and
  tighter default spacing aimed at single-page fit
- adds DocTemplateEngine.count_pages() via LibreOffice+PyMuPDF, surfaced in
  verify()'s page_count field
- updates fee_agreement_tools.py schemas/handlers for client_name + page
  count guidance
- updates unit/billed tests for the new 3-arg render_free_text signature and
  the title's legitimate center alignment

Co-Authored-By: Claude Sonnet 5 <noreply@anthropic.com>
Claude-Session: https://claude.ai/code/session_015Zc4wspYfNP5rb8WAXfjmD
</commit_message>
<xml_diff>
--- a/apps/denidin-app/config/fee_agreement_templates/alternative_tracks.docx
+++ b/apps/denidin-app/config/fee_agreement_templates/alternative_tracks.docx
@@ -6,26 +6,15 @@
       <w:pPr>
         <w:spacing w:after="120"/>
         <w:jc w:val="right"/>
-        <w:bidi/>
-      </w:pPr>
-      <w:r>
         <w:rPr>
-          <w:b/>
-          <w:sz w:val="26"/>
+          <w:rtl/>
         </w:rPr>
-        <w:t>{{FIRM_NAME}}</w:t>
-      </w:r>
-    </w:p>
-    <w:p>
-      <w:pPr>
-        <w:spacing w:after="120"/>
-        <w:jc w:val="right"/>
-        <w:bidi/>
       </w:pPr>
       <w:r>
         <w:rPr>
           <w:b w:val="0"/>
           <w:sz w:val="20"/>
+          <w:rtl/>
         </w:rPr>
         <w:t>{{DATE}}</w:t>
       </w:r>
@@ -34,19 +23,24 @@
       <w:pPr>
         <w:spacing w:after="120"/>
         <w:jc w:val="right"/>
-        <w:bidi/>
+        <w:rPr>
+          <w:rtl/>
+        </w:rPr>
       </w:pPr>
     </w:p>
     <w:p>
       <w:pPr>
         <w:spacing w:after="120"/>
         <w:jc w:val="right"/>
-        <w:bidi/>
+        <w:rPr>
+          <w:rtl/>
+        </w:rPr>
       </w:pPr>
       <w:r>
         <w:rPr>
           <w:b/>
           <w:sz w:val="28"/>
+          <w:rtl/>
         </w:rPr>
         <w:t>הצעת שכר טרחה</w:t>
       </w:r>
@@ -55,19 +49,24 @@
       <w:pPr>
         <w:spacing w:after="120"/>
         <w:jc w:val="right"/>
-        <w:bidi/>
+        <w:rPr>
+          <w:rtl/>
+        </w:rPr>
       </w:pPr>
     </w:p>
     <w:p>
       <w:pPr>
         <w:spacing w:after="120"/>
         <w:jc w:val="right"/>
-        <w:bidi/>
+        <w:rPr>
+          <w:rtl/>
+        </w:rPr>
       </w:pPr>
       <w:r>
         <w:rPr>
           <w:b w:val="0"/>
           <w:sz w:val="22"/>
+          <w:rtl/>
         </w:rPr>
         <w:t>בין {{CLIENT_NAME}} (להלן – הלקוח)</w:t>
       </w:r>
@@ -76,12 +75,15 @@
       <w:pPr>
         <w:spacing w:after="120"/>
         <w:jc w:val="right"/>
-        <w:bidi/>
+        <w:rPr>
+          <w:rtl/>
+        </w:rPr>
       </w:pPr>
       <w:r>
         <w:rPr>
           <w:b w:val="0"/>
           <w:sz w:val="22"/>
+          <w:rtl/>
         </w:rPr>
         <w:t>לבין</w:t>
       </w:r>
@@ -90,33 +92,41 @@
       <w:pPr>
         <w:spacing w:after="120"/>
         <w:jc w:val="right"/>
-        <w:bidi/>
+        <w:rPr>
+          <w:rtl/>
+        </w:rPr>
       </w:pPr>
       <w:r>
         <w:rPr>
           <w:b w:val="0"/>
           <w:sz w:val="22"/>
+          <w:rtl/>
         </w:rPr>
-        <w:t>עו"ד {{FIRM_NAME}} (להלן – עוה"ד)</w:t>
+        <w:t>עו"ד אילה הוניגמן (להלן – עוה"ד)</w:t>
       </w:r>
     </w:p>
     <w:p>
       <w:pPr>
         <w:spacing w:after="120"/>
         <w:jc w:val="right"/>
-        <w:bidi/>
+        <w:rPr>
+          <w:rtl/>
+        </w:rPr>
       </w:pPr>
     </w:p>
     <w:p>
       <w:pPr>
         <w:spacing w:after="120"/>
         <w:jc w:val="right"/>
-        <w:bidi/>
+        <w:rPr>
+          <w:rtl/>
+        </w:rPr>
       </w:pPr>
       <w:r>
         <w:rPr>
           <w:b w:val="0"/>
           <w:sz w:val="22"/>
+          <w:rtl/>
         </w:rPr>
         <w:t>להלן הצעת שכר טרחה עבור ייצוג הלקוח {{SCOPE_OF_WORK}}, בין שני מסלולים חלופיים כמפורט להלן - הלקוח יבחר באחד מהם:</w:t>
       </w:r>
@@ -125,19 +135,24 @@
       <w:pPr>
         <w:spacing w:after="120"/>
         <w:jc w:val="right"/>
-        <w:bidi/>
+        <w:rPr>
+          <w:rtl/>
+        </w:rPr>
       </w:pPr>
     </w:p>
     <w:p>
       <w:pPr>
         <w:spacing w:after="120"/>
         <w:jc w:val="right"/>
-        <w:bidi/>
+        <w:rPr>
+          <w:rtl/>
+        </w:rPr>
       </w:pPr>
       <w:r>
         <w:rPr>
           <w:b/>
           <w:sz w:val="22"/>
+          <w:rtl/>
         </w:rPr>
         <w:t>{{TRACK_LABEL}}</w:t>
       </w:r>
@@ -146,12 +161,15 @@
       <w:pPr>
         <w:spacing w:after="120"/>
         <w:jc w:val="right"/>
-        <w:bidi/>
+        <w:rPr>
+          <w:rtl/>
+        </w:rPr>
       </w:pPr>
       <w:r>
         <w:rPr>
           <w:b w:val="0"/>
           <w:sz w:val="22"/>
+          <w:rtl/>
         </w:rPr>
         <w:t>{{TRACK_TERMS}}</w:t>
       </w:r>
@@ -160,19 +178,24 @@
       <w:pPr>
         <w:spacing w:after="120"/>
         <w:jc w:val="right"/>
-        <w:bidi/>
+        <w:rPr>
+          <w:rtl/>
+        </w:rPr>
       </w:pPr>
     </w:p>
     <w:p>
       <w:pPr>
         <w:spacing w:after="120"/>
         <w:jc w:val="right"/>
-        <w:bidi/>
+        <w:rPr>
+          <w:rtl/>
+        </w:rPr>
       </w:pPr>
       <w:r>
         <w:rPr>
           <w:b/>
           <w:sz w:val="22"/>
+          <w:rtl/>
         </w:rPr>
         <w:t>בנוסף, ככל שיחול, יתווסף על כל אחד מהמסלולים לעיל:</w:t>
       </w:r>
@@ -181,12 +204,15 @@
       <w:pPr>
         <w:spacing w:after="120"/>
         <w:jc w:val="right"/>
-        <w:bidi/>
+        <w:rPr>
+          <w:rtl/>
+        </w:rPr>
       </w:pPr>
       <w:r>
         <w:rPr>
           <w:b w:val="0"/>
           <w:sz w:val="22"/>
+          <w:rtl/>
         </w:rPr>
         <w:t>{{SHARED_ADDON_TERMS}}</w:t>
       </w:r>
@@ -195,19 +221,24 @@
       <w:pPr>
         <w:spacing w:after="120"/>
         <w:jc w:val="right"/>
-        <w:bidi/>
+        <w:rPr>
+          <w:rtl/>
+        </w:rPr>
       </w:pPr>
     </w:p>
     <w:p>
       <w:pPr>
         <w:spacing w:after="120"/>
         <w:jc w:val="right"/>
-        <w:bidi/>
+        <w:rPr>
+          <w:rtl/>
+        </w:rPr>
       </w:pPr>
       <w:r>
         <w:rPr>
           <w:b w:val="0"/>
           <w:sz w:val="22"/>
+          <w:rtl/>
         </w:rPr>
         <w:t>שכר הטרחה של עוה"ד אינו כולל הוצאות כגון צילום חומרים, אגרות וכיוצ"ב. הלקוח ישא באופן בלעדי בהוצאות אשר ישולמו מיד בעת המצאת חשבונית.</w:t>
       </w:r>
@@ -216,12 +247,15 @@
       <w:pPr>
         <w:spacing w:after="120"/>
         <w:jc w:val="right"/>
-        <w:bidi/>
+        <w:rPr>
+          <w:rtl/>
+        </w:rPr>
       </w:pPr>
       <w:r>
         <w:rPr>
           <w:b w:val="0"/>
           <w:sz w:val="22"/>
+          <w:rtl/>
         </w:rPr>
         <w:t>שכר הטרחה המפורט לעיל אינו כולל ייצוג בערכאות ערעור.</w:t>
       </w:r>
@@ -230,19 +264,24 @@
       <w:pPr>
         <w:spacing w:after="120"/>
         <w:jc w:val="right"/>
-        <w:bidi/>
+        <w:rPr>
+          <w:rtl/>
+        </w:rPr>
       </w:pPr>
     </w:p>
     <w:p>
       <w:pPr>
         <w:spacing w:after="120"/>
         <w:jc w:val="right"/>
-        <w:bidi/>
+        <w:rPr>
+          <w:rtl/>
+        </w:rPr>
       </w:pPr>
       <w:r>
         <w:rPr>
           <w:b w:val="0"/>
           <w:sz w:val="22"/>
+          <w:rtl/>
         </w:rPr>
         <w:t>אני מאשר/ת את ההסכם ובוחר/ת במסלול המצוין להלן:</w:t>
       </w:r>
@@ -251,12 +290,15 @@
       <w:pPr>
         <w:spacing w:after="120"/>
         <w:jc w:val="right"/>
-        <w:bidi/>
+        <w:rPr>
+          <w:rtl/>
+        </w:rPr>
       </w:pPr>
       <w:r>
         <w:rPr>
           <w:b w:val="0"/>
           <w:sz w:val="22"/>
+          <w:rtl/>
         </w:rPr>
         <w:t>תאריך: ______________</w:t>
       </w:r>
@@ -265,12 +307,15 @@
       <w:pPr>
         <w:spacing w:after="120"/>
         <w:jc w:val="right"/>
-        <w:bidi/>
+        <w:rPr>
+          <w:rtl/>
+        </w:rPr>
       </w:pPr>
       <w:r>
         <w:rPr>
           <w:b w:val="0"/>
           <w:sz w:val="22"/>
+          <w:rtl/>
         </w:rPr>
         <w:t>שם: {{CLIENT_NAME}}</w:t>
       </w:r>
@@ -279,12 +324,15 @@
       <w:pPr>
         <w:spacing w:after="120"/>
         <w:jc w:val="right"/>
-        <w:bidi/>
+        <w:rPr>
+          <w:rtl/>
+        </w:rPr>
       </w:pPr>
       <w:r>
         <w:rPr>
           <w:b w:val="0"/>
           <w:sz w:val="22"/>
+          <w:rtl/>
         </w:rPr>
         <w:t>מסלול נבחר: ______________</w:t>
       </w:r>
@@ -293,24 +341,107 @@
       <w:pPr>
         <w:spacing w:after="120"/>
         <w:jc w:val="right"/>
-        <w:bidi/>
+        <w:rPr>
+          <w:rtl/>
+        </w:rPr>
       </w:pPr>
       <w:r>
         <w:rPr>
           <w:b w:val="0"/>
           <w:sz w:val="22"/>
+          <w:rtl/>
         </w:rPr>
         <w:t>חתימה: ______________</w:t>
       </w:r>
     </w:p>
     <w:sectPr>
+      <w:headerReference w:type="default" r:id="rId9"/>
+      <w:footerReference w:type="default" r:id="rId10"/>
       <w:pgSz w:w="12240" w:h="15840"/>
-      <w:pgMar w:top="1440" w:right="1800" w:bottom="1440" w:left="1800" w:header="720" w:footer="720" w:gutter="0"/>
+      <w:pgMar w:top="2016" w:right="1800" w:bottom="1440" w:left="1800" w:header="576" w:footer="720" w:gutter="0"/>
       <w:cols w:space="720"/>
+      <w:bidi/>
       <w:docGrid w:linePitch="360"/>
     </w:sectPr>
   </w:body>
 </w:document>
+</file>
+
+<file path=word/footer1.xml><?xml version="1.0" encoding="utf-8"?>
+<w:ftr xmlns:m="http://schemas.openxmlformats.org/officeDocument/2006/math" xmlns:mc="http://schemas.openxmlformats.org/markup-compatibility/2006" xmlns:mo="http://schemas.microsoft.com/office/mac/office/2008/main" xmlns:mv="urn:schemas-microsoft-com:mac:vml" xmlns:o="urn:schemas-microsoft-com:office:office" xmlns:r="http://schemas.openxmlformats.org/officeDocument/2006/relationships" xmlns:v="urn:schemas-microsoft-com:vml" xmlns:w10="urn:schemas-microsoft-com:office:word" xmlns:w14="http://schemas.microsoft.com/office/word/2010/wordml" xmlns:w="http://schemas.openxmlformats.org/wordprocessingml/2006/main" xmlns:wne="http://schemas.microsoft.com/office/word/2006/wordml" xmlns:wp14="http://schemas.microsoft.com/office/word/2010/wordprocessingDrawing" xmlns:wp="http://schemas.openxmlformats.org/drawingml/2006/wordprocessingDrawing" xmlns:wpc="http://schemas.microsoft.com/office/word/2010/wordprocessingCanvas" xmlns:wpg="http://schemas.microsoft.com/office/word/2010/wordprocessingGroup" xmlns:wpi="http://schemas.microsoft.com/office/word/2010/wordprocessingInk" xmlns:wps="http://schemas.microsoft.com/office/word/2010/wordprocessingShape" mc:Ignorable="w14 wp14">
+  <w:p>
+    <w:pPr>
+      <w:pStyle w:val="Footer"/>
+      <w:jc w:val="center"/>
+      <w:rPr>
+        <w:rtl/>
+      </w:rPr>
+    </w:pPr>
+    <w:r>
+      <w:rPr>
+        <w:sz w:val="16"/>
+        <w:rtl/>
+      </w:rPr>
+      <w:t>www.honigman-law.com | Ah@honigman-law.com | tel 050-6205541 | fax 077-4701835</w:t>
+    </w:r>
+  </w:p>
+</w:ftr>
+</file>
+
+<file path=word/header1.xml><?xml version="1.0" encoding="utf-8"?>
+<w:hdr xmlns:m="http://schemas.openxmlformats.org/officeDocument/2006/math" xmlns:mc="http://schemas.openxmlformats.org/markup-compatibility/2006" xmlns:mo="http://schemas.microsoft.com/office/mac/office/2008/main" xmlns:mv="urn:schemas-microsoft-com:mac:vml" xmlns:o="urn:schemas-microsoft-com:office:office" xmlns:r="http://schemas.openxmlformats.org/officeDocument/2006/relationships" xmlns:v="urn:schemas-microsoft-com:vml" xmlns:w10="urn:schemas-microsoft-com:office:word" xmlns:w14="http://schemas.microsoft.com/office/word/2010/wordml" xmlns:w="http://schemas.openxmlformats.org/wordprocessingml/2006/main" xmlns:wne="http://schemas.microsoft.com/office/word/2006/wordml" xmlns:wp14="http://schemas.microsoft.com/office/word/2010/wordprocessingDrawing" xmlns:wp="http://schemas.openxmlformats.org/drawingml/2006/wordprocessingDrawing" xmlns:wpc="http://schemas.microsoft.com/office/word/2010/wordprocessingCanvas" xmlns:wpg="http://schemas.microsoft.com/office/word/2010/wordprocessingGroup" xmlns:wpi="http://schemas.microsoft.com/office/word/2010/wordprocessingInk" xmlns:wps="http://schemas.microsoft.com/office/word/2010/wordprocessingShape" mc:Ignorable="w14 wp14">
+  <w:p>
+    <w:pPr>
+      <w:pStyle w:val="Header"/>
+      <w:jc w:val="right"/>
+      <w:rPr>
+        <w:rtl/>
+      </w:rPr>
+    </w:pPr>
+    <w:r>
+      <w:rPr>
+        <w:rtl/>
+      </w:rPr>
+    </w:r>
+    <w:r>
+      <w:rPr>
+        <w:rtl/>
+      </w:rPr>
+      <w:drawing>
+        <wp:inline xmlns:a="http://schemas.openxmlformats.org/drawingml/2006/main" xmlns:pic="http://schemas.openxmlformats.org/drawingml/2006/picture">
+          <wp:extent cx="685800" cy="810491"/>
+          <wp:docPr id="1" name="Picture 1"/>
+          <wp:cNvGraphicFramePr>
+            <a:graphicFrameLocks noChangeAspect="1"/>
+          </wp:cNvGraphicFramePr>
+          <a:graphic>
+            <a:graphicData uri="http://schemas.openxmlformats.org/drawingml/2006/picture">
+              <pic:pic>
+                <pic:nvPicPr>
+                  <pic:cNvPr id="0" name="honigman-law-logo.png"/>
+                  <pic:cNvPicPr/>
+                </pic:nvPicPr>
+                <pic:blipFill>
+                  <a:blip r:embed="rId1"/>
+                  <a:stretch>
+                    <a:fillRect/>
+                  </a:stretch>
+                </pic:blipFill>
+                <pic:spPr>
+                  <a:xfrm>
+                    <a:off x="0" y="0"/>
+                    <a:ext cx="685800" cy="810491"/>
+                  </a:xfrm>
+                  <a:prstGeom prst="rect"/>
+                </pic:spPr>
+              </pic:pic>
+            </a:graphicData>
+          </a:graphic>
+        </wp:inline>
+      </w:drawing>
+    </w:r>
+  </w:p>
+</w:hdr>
 </file>
 
 <file path=word/numbering.xml><?xml version="1.0" encoding="utf-8"?>
@@ -524,6 +655,7 @@
         <w:rFonts w:asciiTheme="minorHAnsi" w:eastAsiaTheme="minorEastAsia" w:hAnsiTheme="minorHAnsi" w:cstheme="minorBidi"/>
         <w:sz w:val="22"/>
         <w:szCs w:val="22"/>
+        <w:rtl/>
         <w:lang w:val="en-US" w:eastAsia="en-US" w:bidi="ar-SA"/>
       </w:rPr>
     </w:rPrDefault>
@@ -676,8 +808,10 @@
     <w:name w:val="Normal"/>
     <w:qFormat/>
     <w:rsid w:val="00FC693F"/>
+    <w:pPr/>
     <w:rPr>
       <w:sz w:val="22"/>
+      <w:rtl/>
     </w:rPr>
   </w:style>
   <w:style w:type="paragraph" w:styleId="Header">

</xml_diff>